<commit_message>
Align guide and tracker with revised agenda times (9:00-4:00 days, 12-1 lunch)
Co-Authored-By: Claude Sonnet 5.5 <noreply@anthropic.com>
Claude-Session: https://claude.ai/code/session_01W6mJ1brKLV5iN37yui29cR
</commit_message>
<xml_diff>
--- a/ezurio-onsite-prep/02_Ezurio_Onsite_Discussion_Guide_INTERNAL.docx
+++ b/ezurio-onsite-prep/02_Ezurio_Onsite_Discussion_Guide_INTERNAL.docx
@@ -309,7 +309,7 @@
                 <w:i w:val="0"/>
                 <w:sz w:val="18"/>
               </w:rPr>
-              <w:t>Mon 8:00 – 8:45</w:t>
+              <w:t>Mon 9:00 – 9:15</w:t>
             </w:r>
           </w:p>
         </w:tc>
@@ -365,7 +365,7 @@
                 <w:i w:val="0"/>
                 <w:sz w:val="18"/>
               </w:rPr>
-              <w:t>Mon 8:45 – 10:45</w:t>
+              <w:t>Mon 9:15 – 10:45</w:t>
             </w:r>
           </w:p>
         </w:tc>
@@ -421,7 +421,7 @@
                 <w:i w:val="0"/>
                 <w:sz w:val="18"/>
               </w:rPr>
-              <w:t>Mon 11:00 – 12:30</w:t>
+              <w:t>Mon 11:00 – 12:00</w:t>
             </w:r>
           </w:p>
         </w:tc>
@@ -477,7 +477,7 @@
                 <w:i w:val="0"/>
                 <w:sz w:val="18"/>
               </w:rPr>
-              <w:t>Mon 1:15 – 3:15</w:t>
+              <w:t>Mon 1:00 – 3:00</w:t>
             </w:r>
           </w:p>
         </w:tc>
@@ -533,7 +533,7 @@
                 <w:i w:val="0"/>
                 <w:sz w:val="18"/>
               </w:rPr>
-              <w:t>Mon 3:30 – 4:30</w:t>
+              <w:t>Mon 3:15 – 4:00</w:t>
             </w:r>
           </w:p>
         </w:tc>
@@ -589,7 +589,7 @@
                 <w:i w:val="0"/>
                 <w:sz w:val="18"/>
               </w:rPr>
-              <w:t>Tue 8:00 – 10:00</w:t>
+              <w:t>Tue 9:00 – 10:00</w:t>
             </w:r>
           </w:p>
         </w:tc>
@@ -701,7 +701,7 @@
                 <w:i w:val="0"/>
                 <w:sz w:val="18"/>
               </w:rPr>
-              <w:t>Tue 12:45 – 2:45</w:t>
+              <w:t>Tue 1:00 – 2:45</w:t>
             </w:r>
           </w:p>
         </w:tc>
@@ -757,7 +757,7 @@
                 <w:i w:val="0"/>
                 <w:sz w:val="18"/>
               </w:rPr>
-              <w:t>Tue 3:00 – 4:30</w:t>
+              <w:t>Tue 3:00 – 4:00</w:t>
             </w:r>
           </w:p>
         </w:tc>
@@ -813,7 +813,7 @@
                 <w:i w:val="0"/>
                 <w:sz w:val="18"/>
               </w:rPr>
-              <w:t>Wed 8:00 – 8:30</w:t>
+              <w:t>Wed 9:00 – 9:15</w:t>
             </w:r>
           </w:p>
         </w:tc>
@@ -869,7 +869,7 @@
                 <w:i w:val="0"/>
                 <w:sz w:val="18"/>
               </w:rPr>
-              <w:t>Wed 8:30 – 10:00</w:t>
+              <w:t>Wed 9:15 – 10:15</w:t>
             </w:r>
           </w:p>
         </w:tc>
@@ -925,7 +925,7 @@
                 <w:i w:val="0"/>
                 <w:sz w:val="18"/>
               </w:rPr>
-              <w:t>Wed 10:15 – 12:00</w:t>
+              <w:t>Wed 10:30 – 12:00</w:t>
             </w:r>
           </w:p>
         </w:tc>
@@ -981,7 +981,7 @@
                 <w:i w:val="0"/>
                 <w:sz w:val="18"/>
               </w:rPr>
-              <w:t>Wed 12:45 – 2:00</w:t>
+              <w:t>Wed 1:00 – 2:00</w:t>
             </w:r>
           </w:p>
         </w:tc>
@@ -1093,7 +1093,7 @@
                 <w:i w:val="0"/>
                 <w:sz w:val="18"/>
               </w:rPr>
-              <w:t>Wed 3:45 – 4:30</w:t>
+              <w:t>Wed 3:45 – 4:00</w:t>
             </w:r>
           </w:p>
         </w:tc>
@@ -1189,7 +1189,7 @@
                 <w:color w:val="FFFFFF"/>
                 <w:sz w:val="18"/>
               </w:rPr>
-              <w:t>Mon 10/19 · 8:00 – 8:45  |  David, John, Gateworks leadership [[TBC]]</w:t>
+              <w:t>Mon 10/19 · 9:00 – 9:15  |  David, John, Gateworks leadership [[TBC]]</w:t>
             </w:r>
           </w:p>
         </w:tc>
@@ -1207,7 +1207,7 @@
           <w:i/>
           <w:sz w:val="18"/>
         </w:rPr>
-        <w:t>Alignment, not requirements. Keep the framing on Gateworks' automation and performance and the Irvine improvements. Do NOT reference the footprint decision, any acquisition activity, or any site consolidation – that is confidential and the site teams are not briefed.</w:t>
+        <w:t>TIME-BOX: 15 minutes – pick 3–4 questions (success, Jason's objectives, what must not be lost, top worry). Alignment, not requirements. Keep the framing on Gateworks' automation and performance and the Irvine improvements. Do NOT reference the footprint decision, any acquisition activity, or any site consolidation – that is confidential and the site teams are not briefed.</w:t>
       </w:r>
     </w:p>
     <w:p>
@@ -1441,7 +1441,7 @@
                 <w:color w:val="FFFFFF"/>
                 <w:sz w:val="18"/>
               </w:rPr>
-              <w:t>Mon 10/19 · 8:45 – 10:45  |  Operations/production lead, quality lead, supervisors [[TBC]]</w:t>
+              <w:t>Mon 10/19 · 9:15 – 10:45  |  Operations/production lead, quality lead, supervisors [[TBC]]</w:t>
             </w:r>
           </w:p>
         </w:tc>
@@ -1459,7 +1459,7 @@
           <w:i/>
           <w:sz w:val="18"/>
         </w:rPr>
-        <w:t>Follow one real job end to end. 'Show me, don't tell me.' Capture where people touch a screen/scanner and where they leave the system (paper, spreadsheet, whiteboard). Photos only if the site allows – and see the ITAR/CUI note in 2.2 before capturing anything.</w:t>
+        <w:t>TIME-BOX: 90 minutes. Follow one real job end to end. 'Show me, don't tell me.' Capture where people touch a screen/scanner and where they leave the system (paper, spreadsheet, whiteboard). Photos only if the site allows – and see the ITAR/CUI note in 2.2 before capturing anything.</w:t>
       </w:r>
     </w:p>
     <w:p>
@@ -1681,7 +1681,7 @@
                 <w:color w:val="FFFFFF"/>
                 <w:sz w:val="18"/>
               </w:rPr>
-              <w:t>Mon 10/19 · 11:00 – 12:30  |  GWTrack power users/admin, production control [[TBC]]</w:t>
+              <w:t>Mon 10/19 · 11:00 – 12:00  |  GWTrack power users/admin, production control [[TBC]]</w:t>
             </w:r>
           </w:p>
         </w:tc>
@@ -1699,7 +1699,7 @@
           <w:i/>
           <w:sz w:val="18"/>
         </w:rPr>
-        <w:t>Have them drive. Record screens/key fields as feature inventory rows in the Requirements tracker (tab 2) – one row per capability. Ask 'what does the system do automatically vs. what does a person do?' for each. Per client update: GWTrack will not be easily modified into an MES, so capture what it does today in enough detail to rationalize across NetSuite / Arena / a new MES.</w:t>
+        <w:t>TIME-BOX: 60 minutes (was 90) – prioritize the feature inventory and traceability; push automation/performance depth to 2.3 and any quality overflow to 1.4. Have them drive. Record screens/key fields as feature inventory rows in the Requirements tracker (tab 2) – one row per capability. Ask 'what does the system do automatically vs. what does a person do?' for each. Per client update: GWTrack will not be easily modified into an MES, so capture what it does today in enough detail to rationalize across NetSuite / Arena / a new MES.</w:t>
       </w:r>
     </w:p>
     <w:p>
@@ -1933,7 +1933,7 @@
                 <w:color w:val="FFFFFF"/>
                 <w:sz w:val="18"/>
               </w:rPr>
-              <w:t>Mon 10/19 · 1:15 – 3:15  |  Quality lead, supervisors, inventory/materials [[TBC]]</w:t>
+              <w:t>Mon 10/19 · 1:00 – 3:00  |  Quality lead, supervisors, inventory/materials [[TBC]]</w:t>
             </w:r>
           </w:p>
         </w:tc>
@@ -2173,7 +2173,7 @@
                 <w:color w:val="FFFFFF"/>
                 <w:sz w:val="18"/>
               </w:rPr>
-              <w:t>Mon 10/19 · 3:30 – 4:30  |  David, John, site leadership [[TBC]]</w:t>
+              <w:t>Mon 10/19 · 3:15 – 4:00  |  David, John, site leadership [[TBC]]</w:t>
             </w:r>
           </w:p>
         </w:tc>
@@ -2292,7 +2292,7 @@
                 <w:color w:val="FFFFFF"/>
                 <w:sz w:val="18"/>
               </w:rPr>
-              <w:t>Tue 10/20 · 8:00 – 10:00  |  IT/NetSuite admin, GWTrack admin, engineering (Arena) [[TBC]]</w:t>
+              <w:t>Tue 10/20 · 9:00 – 10:00  |  IT/NetSuite admin, GWTrack admin, engineering (Arena) [[TBC]]</w:t>
             </w:r>
           </w:p>
         </w:tc>
@@ -2716,7 +2716,7 @@
                 <w:color w:val="FFFFFF"/>
                 <w:sz w:val="18"/>
               </w:rPr>
-              <w:t>Tue 10/20 · 12:45 – 2:45  |  David, John, site leadership, power users [[TBC]]</w:t>
+              <w:t>Tue 10/20 · 1:00 – 2:45  |  David, John, site leadership, power users [[TBC]]</w:t>
             </w:r>
           </w:p>
         </w:tc>
@@ -2944,7 +2944,7 @@
                 <w:color w:val="FFFFFF"/>
                 <w:sz w:val="18"/>
               </w:rPr>
-              <w:t>Tue 10/20 · 3:00 – 4:30  |  David, John, site leadership [[TBC]]</w:t>
+              <w:t>Tue 10/20 · 3:00 – 4:00  |  David, John, site leadership [[TBC]]</w:t>
             </w:r>
           </w:p>
         </w:tc>
@@ -2962,7 +2962,7 @@
           <w:i/>
           <w:sz w:val="18"/>
         </w:rPr>
-        <w:t>Read back every requirement captured in the tracker; get explicit Must/Should/Could on each. Where there's disagreement, capture both views. End by agreeing the follow-up list and owners. The team travels to Irvine that evening.</w:t>
+        <w:t>TIME-BOX: 60 minutes (was 90) – read back only Must/Should candidates; park Could-haves in the tracker for async review. Read back every requirement captured in the tracker; get explicit Must/Should/Could on each. Where there's disagreement, capture both views. End by agreeing the follow-up list and owners. The team travels to Irvine that evening.</w:t>
       </w:r>
     </w:p>
     <w:p>
@@ -3095,7 +3095,7 @@
                 <w:color w:val="FFFFFF"/>
                 <w:sz w:val="18"/>
               </w:rPr>
-              <w:t>Wed 10/21 · 8:00 – 8:30  |  David, John, Irvine ops leadership [[TBC]]</w:t>
+              <w:t>Wed 10/21 · 9:00 – 9:15  |  David, John, Irvine ops leadership [[TBC]]</w:t>
             </w:r>
           </w:p>
         </w:tc>
@@ -3113,7 +3113,7 @@
           <w:i/>
           <w:sz w:val="18"/>
         </w:rPr>
-        <w:t>Irvine went live on NetSuite WMS + Manufacturing Mobile in July 2025 (MFG optimization UAT June 2025). Open by asking what has changed since – we haven't seen the floor since go-live. Hana/Kyle (Y-Hire) dial in from 10:15; confirm availability given India working hours.</w:t>
+        <w:t>TIME-BOX: 15 minutes. Irvine went live on NetSuite WMS + Manufacturing Mobile in July 2025 (MFG optimization UAT June 2025). Open by asking what has changed since – we haven't seen the floor since go-live. Hana/Kyle (Y-Hire) dial in from 10:30 (about 11pm IST); confirm availability given India working hours.</w:t>
       </w:r>
     </w:p>
     <w:p>
@@ -3223,7 +3223,7 @@
                 <w:color w:val="FFFFFF"/>
                 <w:sz w:val="18"/>
               </w:rPr>
-              <w:t>Wed 10/21 · 8:30 – 10:00  |  Warehouse operators/manager, QC, production operators [[TBC]]</w:t>
+              <w:t>Wed 10/21 · 9:15 – 10:15  |  Warehouse operators/manager, QC, production operators [[TBC]]</w:t>
             </w:r>
           </w:p>
         </w:tc>
@@ -3241,7 +3241,7 @@
           <w:i/>
           <w:sz w:val="18"/>
         </w:rPr>
-        <w:t>Use the annotated Irvine process flow (04_Irvine_Process_Flow_Annotated.png) as the spine. Watch a real WO if one is staged. Validate each step against the Visio (July 2025) and the process outlines (QC does Transfer All + WO Issue per 2025 docs; the Visio shows the Material Handler lane – confirm who actually does it).</w:t>
+        <w:t>TIME-BOX: 60 minutes (was 90) – observe one WO flow; defer detailed control and timekeeping questions to 3.3. Use the annotated Irvine process flow (04_Irvine_Process_Flow_Annotated.png) as the spine. Watch a real WO if one is staged. Validate each step against the Visio (July 2025) and the process outlines (QC does Transfer All + WO Issue per 2025 docs; the Visio shows the Material Handler lane – confirm who actually does it).</w:t>
       </w:r>
     </w:p>
     <w:p>
@@ -3431,7 +3431,7 @@
                 <w:color w:val="FFFFFF"/>
                 <w:sz w:val="18"/>
               </w:rPr>
-              <w:t>Wed 10/21 · 10:15 – 12:00  |  Production manager, planner, cost accounting, QC lead [[TBC]] + Y-Hire team (dial-in)</w:t>
+              <w:t>Wed 10/21 · 10:30 – 12:00  |  Production manager, planner, cost accounting, QC lead [[TBC]] + Y-Hire team (dial-in)</w:t>
             </w:r>
           </w:p>
         </w:tc>
@@ -3647,7 +3647,7 @@
                 <w:color w:val="FFFFFF"/>
                 <w:sz w:val="18"/>
               </w:rPr>
-              <w:t>Wed 10/21 · 12:45 – 2:00  |  QC lead, warehouse manager, production manager [[TBC]]</w:t>
+              <w:t>Wed 10/21 · 1:00 – 2:00  |  QC lead, warehouse manager, production manager [[TBC]]</w:t>
             </w:r>
           </w:p>
         </w:tc>
@@ -3935,7 +3935,7 @@
                 <w:color w:val="FFFFFF"/>
                 <w:sz w:val="18"/>
               </w:rPr>
-              <w:t>Wed 10/21 · 3:45 – 4:30  |  David, John [[TBC]]</w:t>
+              <w:t>Wed 10/21 · 3:45 – 4:00  |  David, John [[TBC]]</w:t>
             </w:r>
           </w:p>
         </w:tc>
@@ -3953,7 +3953,7 @@
           <w:i/>
           <w:sz w:val="18"/>
         </w:rPr>
-        <w:t>Recap, confirm what the readout will contain and timing. Note: Jordan is on PTO Oct 23 – Nov 2; confirm who distributes the draft if it is ready before then (Grant/Rohit).</w:t>
+        <w:t>TIME-BOX: 15 minutes. Recap, confirm what the readout will contain and timing. Note: Jordan is on PTO Oct 23 – Nov 2; confirm who distributes the draft if it is ready before then (Grant/Rohit).</w:t>
       </w:r>
     </w:p>
     <w:p>

</xml_diff>